<commit_message>
Add videos 5,5.1 and 6
</commit_message>
<xml_diff>
--- a/Script and Audio/Final Scripts/All_Notes_Scripts_27.11_V7.docx
+++ b/Script and Audio/Final Scripts/All_Notes_Scripts_27.11_V7.docx
@@ -69,7 +69,7 @@
             </w:rPr>
             <w:fldChar w:fldCharType="separate"/>
           </w:r>
-          <w:hyperlink w:anchor="_Toc215155673" w:history="1">
+          <w:hyperlink w:anchor="_Toc215509330" w:history="1">
             <w:r>
               <w:rPr>
                 <w:rStyle w:val="Hyperlink"/>
@@ -96,7 +96,7 @@
                 <w:noProof/>
                 <w:webHidden/>
               </w:rPr>
-              <w:instrText xml:space="preserve"> PAGEREF _Toc215155673 \h </w:instrText>
+              <w:instrText xml:space="preserve"> PAGEREF _Toc215509330 \h </w:instrText>
             </w:r>
             <w:r>
               <w:rPr>
@@ -137,7 +137,7 @@
               <w:noProof/>
             </w:rPr>
           </w:pPr>
-          <w:hyperlink w:anchor="_Toc215155674" w:history="1">
+          <w:hyperlink w:anchor="_Toc215509331" w:history="1">
             <w:r>
               <w:rPr>
                 <w:rStyle w:val="Hyperlink"/>
@@ -164,7 +164,7 @@
                 <w:noProof/>
                 <w:webHidden/>
               </w:rPr>
-              <w:instrText xml:space="preserve"> PAGEREF _Toc215155674 \h </w:instrText>
+              <w:instrText xml:space="preserve"> PAGEREF _Toc215509331 \h </w:instrText>
             </w:r>
             <w:r>
               <w:rPr>
@@ -205,7 +205,7 @@
               <w:noProof/>
             </w:rPr>
           </w:pPr>
-          <w:hyperlink w:anchor="_Toc215155675" w:history="1">
+          <w:hyperlink w:anchor="_Toc215509332" w:history="1">
             <w:r>
               <w:rPr>
                 <w:rStyle w:val="Hyperlink"/>
@@ -232,7 +232,7 @@
                 <w:noProof/>
                 <w:webHidden/>
               </w:rPr>
-              <w:instrText xml:space="preserve"> PAGEREF _Toc215155675 \h </w:instrText>
+              <w:instrText xml:space="preserve"> PAGEREF _Toc215509332 \h </w:instrText>
             </w:r>
             <w:r>
               <w:rPr>
@@ -273,7 +273,7 @@
               <w:noProof/>
             </w:rPr>
           </w:pPr>
-          <w:hyperlink w:anchor="_Toc215155676" w:history="1">
+          <w:hyperlink w:anchor="_Toc215509333" w:history="1">
             <w:r>
               <w:rPr>
                 <w:rStyle w:val="Hyperlink"/>
@@ -300,7 +300,7 @@
                 <w:noProof/>
                 <w:webHidden/>
               </w:rPr>
-              <w:instrText xml:space="preserve"> PAGEREF _Toc215155676 \h </w:instrText>
+              <w:instrText xml:space="preserve"> PAGEREF _Toc215509333 \h </w:instrText>
             </w:r>
             <w:r>
               <w:rPr>
@@ -341,7 +341,7 @@
               <w:noProof/>
             </w:rPr>
           </w:pPr>
-          <w:hyperlink w:anchor="_Toc215155677" w:history="1">
+          <w:hyperlink w:anchor="_Toc215509334" w:history="1">
             <w:r>
               <w:rPr>
                 <w:rStyle w:val="Hyperlink"/>
@@ -368,7 +368,7 @@
                 <w:noProof/>
                 <w:webHidden/>
               </w:rPr>
-              <w:instrText xml:space="preserve"> PAGEREF _Toc215155677 \h </w:instrText>
+              <w:instrText xml:space="preserve"> PAGEREF _Toc215509334 \h </w:instrText>
             </w:r>
             <w:r>
               <w:rPr>
@@ -409,7 +409,7 @@
               <w:noProof/>
             </w:rPr>
           </w:pPr>
-          <w:hyperlink w:anchor="_Toc215155678" w:history="1">
+          <w:hyperlink w:anchor="_Toc215509335" w:history="1">
             <w:r>
               <w:rPr>
                 <w:rStyle w:val="Hyperlink"/>
@@ -436,7 +436,7 @@
                 <w:noProof/>
                 <w:webHidden/>
               </w:rPr>
-              <w:instrText xml:space="preserve"> PAGEREF _Toc215155678 \h </w:instrText>
+              <w:instrText xml:space="preserve"> PAGEREF _Toc215509335 \h </w:instrText>
             </w:r>
             <w:r>
               <w:rPr>
@@ -477,7 +477,7 @@
               <w:noProof/>
             </w:rPr>
           </w:pPr>
-          <w:hyperlink w:anchor="_Toc215155679" w:history="1">
+          <w:hyperlink w:anchor="_Toc215509336" w:history="1">
             <w:r>
               <w:rPr>
                 <w:rStyle w:val="Hyperlink"/>
@@ -504,7 +504,7 @@
                 <w:noProof/>
                 <w:webHidden/>
               </w:rPr>
-              <w:instrText xml:space="preserve"> PAGEREF _Toc215155679 \h </w:instrText>
+              <w:instrText xml:space="preserve"> PAGEREF _Toc215509336 \h </w:instrText>
             </w:r>
             <w:r>
               <w:rPr>
@@ -545,7 +545,7 @@
               <w:noProof/>
             </w:rPr>
           </w:pPr>
-          <w:hyperlink w:anchor="_Toc215155680" w:history="1">
+          <w:hyperlink w:anchor="_Toc215509337" w:history="1">
             <w:r>
               <w:rPr>
                 <w:rStyle w:val="Hyperlink"/>
@@ -572,7 +572,7 @@
                 <w:noProof/>
                 <w:webHidden/>
               </w:rPr>
-              <w:instrText xml:space="preserve"> PAGEREF _Toc215155680 \h </w:instrText>
+              <w:instrText xml:space="preserve"> PAGEREF _Toc215509337 \h </w:instrText>
             </w:r>
             <w:r>
               <w:rPr>
@@ -613,7 +613,7 @@
               <w:noProof/>
             </w:rPr>
           </w:pPr>
-          <w:hyperlink w:anchor="_Toc215155681" w:history="1">
+          <w:hyperlink w:anchor="_Toc215509338" w:history="1">
             <w:r>
               <w:rPr>
                 <w:rStyle w:val="Hyperlink"/>
@@ -640,7 +640,7 @@
                 <w:noProof/>
                 <w:webHidden/>
               </w:rPr>
-              <w:instrText xml:space="preserve"> PAGEREF _Toc215155681 \h </w:instrText>
+              <w:instrText xml:space="preserve"> PAGEREF _Toc215509338 \h </w:instrText>
             </w:r>
             <w:r>
               <w:rPr>
@@ -660,7 +660,7 @@
                 <w:noProof/>
                 <w:webHidden/>
               </w:rPr>
-              <w:t>43</w:t>
+              <w:t>44</w:t>
             </w:r>
             <w:r>
               <w:rPr>
@@ -681,7 +681,7 @@
               <w:noProof/>
             </w:rPr>
           </w:pPr>
-          <w:hyperlink w:anchor="_Toc215155682" w:history="1">
+          <w:hyperlink w:anchor="_Toc215509339" w:history="1">
             <w:r>
               <w:rPr>
                 <w:rStyle w:val="Hyperlink"/>
@@ -708,7 +708,7 @@
                 <w:noProof/>
                 <w:webHidden/>
               </w:rPr>
-              <w:instrText xml:space="preserve"> PAGEREF _Toc215155682 \h </w:instrText>
+              <w:instrText xml:space="preserve"> PAGEREF _Toc215509339 \h </w:instrText>
             </w:r>
             <w:r>
               <w:rPr>
@@ -728,7 +728,7 @@
                 <w:noProof/>
                 <w:webHidden/>
               </w:rPr>
-              <w:t>48</w:t>
+              <w:t>49</w:t>
             </w:r>
             <w:r>
               <w:rPr>
@@ -749,7 +749,7 @@
               <w:noProof/>
             </w:rPr>
           </w:pPr>
-          <w:hyperlink w:anchor="_Toc215155683" w:history="1">
+          <w:hyperlink w:anchor="_Toc215509340" w:history="1">
             <w:r>
               <w:rPr>
                 <w:rStyle w:val="Hyperlink"/>
@@ -776,7 +776,7 @@
                 <w:noProof/>
                 <w:webHidden/>
               </w:rPr>
-              <w:instrText xml:space="preserve"> PAGEREF _Toc215155683 \h </w:instrText>
+              <w:instrText xml:space="preserve"> PAGEREF _Toc215509340 \h </w:instrText>
             </w:r>
             <w:r>
               <w:rPr>
@@ -796,7 +796,7 @@
                 <w:noProof/>
                 <w:webHidden/>
               </w:rPr>
-              <w:t>56</w:t>
+              <w:t>57</w:t>
             </w:r>
             <w:r>
               <w:rPr>
@@ -817,7 +817,7 @@
               <w:noProof/>
             </w:rPr>
           </w:pPr>
-          <w:hyperlink w:anchor="_Toc215155684" w:history="1">
+          <w:hyperlink w:anchor="_Toc215509341" w:history="1">
             <w:r>
               <w:rPr>
                 <w:rStyle w:val="Hyperlink"/>
@@ -844,7 +844,7 @@
                 <w:noProof/>
                 <w:webHidden/>
               </w:rPr>
-              <w:instrText xml:space="preserve"> PAGEREF _Toc215155684 \h </w:instrText>
+              <w:instrText xml:space="preserve"> PAGEREF _Toc215509341 \h </w:instrText>
             </w:r>
             <w:r>
               <w:rPr>
@@ -864,7 +864,7 @@
                 <w:noProof/>
                 <w:webHidden/>
               </w:rPr>
-              <w:t>64</w:t>
+              <w:t>65</w:t>
             </w:r>
             <w:r>
               <w:rPr>
@@ -885,7 +885,7 @@
               <w:noProof/>
             </w:rPr>
           </w:pPr>
-          <w:hyperlink w:anchor="_Toc215155685" w:history="1">
+          <w:hyperlink w:anchor="_Toc215509342" w:history="1">
             <w:r>
               <w:rPr>
                 <w:rStyle w:val="Hyperlink"/>
@@ -912,7 +912,7 @@
                 <w:noProof/>
                 <w:webHidden/>
               </w:rPr>
-              <w:instrText xml:space="preserve"> PAGEREF _Toc215155685 \h </w:instrText>
+              <w:instrText xml:space="preserve"> PAGEREF _Toc215509342 \h </w:instrText>
             </w:r>
             <w:r>
               <w:rPr>
@@ -953,7 +953,7 @@
               <w:noProof/>
             </w:rPr>
           </w:pPr>
-          <w:hyperlink w:anchor="_Toc215155686" w:history="1">
+          <w:hyperlink w:anchor="_Toc215509343" w:history="1">
             <w:r>
               <w:rPr>
                 <w:rStyle w:val="Hyperlink"/>
@@ -980,7 +980,7 @@
                 <w:noProof/>
                 <w:webHidden/>
               </w:rPr>
-              <w:instrText xml:space="preserve"> PAGEREF _Toc215155686 \h </w:instrText>
+              <w:instrText xml:space="preserve"> PAGEREF _Toc215509343 \h </w:instrText>
             </w:r>
             <w:r>
               <w:rPr>
@@ -1000,7 +1000,7 @@
                 <w:noProof/>
                 <w:webHidden/>
               </w:rPr>
-              <w:t>79</w:t>
+              <w:t>80</w:t>
             </w:r>
             <w:r>
               <w:rPr>
@@ -1021,7 +1021,7 @@
               <w:noProof/>
             </w:rPr>
           </w:pPr>
-          <w:hyperlink w:anchor="_Toc215155687" w:history="1">
+          <w:hyperlink w:anchor="_Toc215509344" w:history="1">
             <w:r>
               <w:rPr>
                 <w:rStyle w:val="Hyperlink"/>
@@ -1048,7 +1048,7 @@
                 <w:noProof/>
                 <w:webHidden/>
               </w:rPr>
-              <w:instrText xml:space="preserve"> PAGEREF _Toc215155687 \h </w:instrText>
+              <w:instrText xml:space="preserve"> PAGEREF _Toc215509344 \h </w:instrText>
             </w:r>
             <w:r>
               <w:rPr>
@@ -1068,7 +1068,7 @@
                 <w:noProof/>
                 <w:webHidden/>
               </w:rPr>
-              <w:t>88</w:t>
+              <w:t>90</w:t>
             </w:r>
             <w:r>
               <w:rPr>
@@ -1089,7 +1089,7 @@
               <w:noProof/>
             </w:rPr>
           </w:pPr>
-          <w:hyperlink w:anchor="_Toc215155688" w:history="1">
+          <w:hyperlink w:anchor="_Toc215509345" w:history="1">
             <w:r>
               <w:rPr>
                 <w:rStyle w:val="Hyperlink"/>
@@ -1116,7 +1116,7 @@
                 <w:noProof/>
                 <w:webHidden/>
               </w:rPr>
-              <w:instrText xml:space="preserve"> PAGEREF _Toc215155688 \h </w:instrText>
+              <w:instrText xml:space="preserve"> PAGEREF _Toc215509345 \h </w:instrText>
             </w:r>
             <w:r>
               <w:rPr>
@@ -1136,7 +1136,7 @@
                 <w:noProof/>
                 <w:webHidden/>
               </w:rPr>
-              <w:t>101</w:t>
+              <w:t>103</w:t>
             </w:r>
             <w:r>
               <w:rPr>
@@ -1157,7 +1157,7 @@
               <w:noProof/>
             </w:rPr>
           </w:pPr>
-          <w:hyperlink w:anchor="_Toc215155689" w:history="1">
+          <w:hyperlink w:anchor="_Toc215509346" w:history="1">
             <w:r>
               <w:rPr>
                 <w:rStyle w:val="Hyperlink"/>
@@ -1184,7 +1184,7 @@
                 <w:noProof/>
                 <w:webHidden/>
               </w:rPr>
-              <w:instrText xml:space="preserve"> PAGEREF _Toc215155689 \h </w:instrText>
+              <w:instrText xml:space="preserve"> PAGEREF _Toc215509346 \h </w:instrText>
             </w:r>
             <w:r>
               <w:rPr>
@@ -1204,7 +1204,7 @@
                 <w:noProof/>
                 <w:webHidden/>
               </w:rPr>
-              <w:t>115</w:t>
+              <w:t>116</w:t>
             </w:r>
             <w:r>
               <w:rPr>
@@ -1225,7 +1225,7 @@
               <w:noProof/>
             </w:rPr>
           </w:pPr>
-          <w:hyperlink w:anchor="_Toc215155690" w:history="1">
+          <w:hyperlink w:anchor="_Toc215509347" w:history="1">
             <w:r>
               <w:rPr>
                 <w:rStyle w:val="Hyperlink"/>
@@ -1252,7 +1252,7 @@
                 <w:noProof/>
                 <w:webHidden/>
               </w:rPr>
-              <w:instrText xml:space="preserve"> PAGEREF _Toc215155690 \h </w:instrText>
+              <w:instrText xml:space="preserve"> PAGEREF _Toc215509347 \h </w:instrText>
             </w:r>
             <w:r>
               <w:rPr>
@@ -1272,7 +1272,7 @@
                 <w:noProof/>
                 <w:webHidden/>
               </w:rPr>
-              <w:t>120</w:t>
+              <w:t>121</w:t>
             </w:r>
             <w:r>
               <w:rPr>
@@ -1293,7 +1293,7 @@
               <w:noProof/>
             </w:rPr>
           </w:pPr>
-          <w:hyperlink w:anchor="_Toc215155691" w:history="1">
+          <w:hyperlink w:anchor="_Toc215509348" w:history="1">
             <w:r>
               <w:rPr>
                 <w:rStyle w:val="Hyperlink"/>
@@ -1320,7 +1320,7 @@
                 <w:noProof/>
                 <w:webHidden/>
               </w:rPr>
-              <w:instrText xml:space="preserve"> PAGEREF _Toc215155691 \h </w:instrText>
+              <w:instrText xml:space="preserve"> PAGEREF _Toc215509348 \h </w:instrText>
             </w:r>
             <w:r>
               <w:rPr>
@@ -1340,7 +1340,7 @@
                 <w:noProof/>
                 <w:webHidden/>
               </w:rPr>
-              <w:t>131</w:t>
+              <w:t>133</w:t>
             </w:r>
             <w:r>
               <w:rPr>
@@ -1361,7 +1361,7 @@
               <w:noProof/>
             </w:rPr>
           </w:pPr>
-          <w:hyperlink w:anchor="_Toc215155692" w:history="1">
+          <w:hyperlink w:anchor="_Toc215509349" w:history="1">
             <w:r>
               <w:rPr>
                 <w:rStyle w:val="Hyperlink"/>
@@ -1388,7 +1388,7 @@
                 <w:noProof/>
                 <w:webHidden/>
               </w:rPr>
-              <w:instrText xml:space="preserve"> PAGEREF _Toc215155692 \h </w:instrText>
+              <w:instrText xml:space="preserve"> PAGEREF _Toc215509349 \h </w:instrText>
             </w:r>
             <w:r>
               <w:rPr>
@@ -1408,7 +1408,7 @@
                 <w:noProof/>
                 <w:webHidden/>
               </w:rPr>
-              <w:t>146</w:t>
+              <w:t>149</w:t>
             </w:r>
             <w:r>
               <w:rPr>
@@ -1429,7 +1429,7 @@
               <w:noProof/>
             </w:rPr>
           </w:pPr>
-          <w:hyperlink w:anchor="_Toc215155693" w:history="1">
+          <w:hyperlink w:anchor="_Toc215509350" w:history="1">
             <w:r>
               <w:rPr>
                 <w:rStyle w:val="Hyperlink"/>
@@ -1456,7 +1456,7 @@
                 <w:noProof/>
                 <w:webHidden/>
               </w:rPr>
-              <w:instrText xml:space="preserve"> PAGEREF _Toc215155693 \h </w:instrText>
+              <w:instrText xml:space="preserve"> PAGEREF _Toc215509350 \h </w:instrText>
             </w:r>
             <w:r>
               <w:rPr>
@@ -1476,7 +1476,7 @@
                 <w:noProof/>
                 <w:webHidden/>
               </w:rPr>
-              <w:t>152</w:t>
+              <w:t>155</w:t>
             </w:r>
             <w:r>
               <w:rPr>
@@ -1497,7 +1497,7 @@
               <w:noProof/>
             </w:rPr>
           </w:pPr>
-          <w:hyperlink w:anchor="_Toc215155694" w:history="1">
+          <w:hyperlink w:anchor="_Toc215509351" w:history="1">
             <w:r>
               <w:rPr>
                 <w:rStyle w:val="Hyperlink"/>
@@ -1524,7 +1524,7 @@
                 <w:noProof/>
                 <w:webHidden/>
               </w:rPr>
-              <w:instrText xml:space="preserve"> PAGEREF _Toc215155694 \h </w:instrText>
+              <w:instrText xml:space="preserve"> PAGEREF _Toc215509351 \h </w:instrText>
             </w:r>
             <w:r>
               <w:rPr>
@@ -1544,7 +1544,7 @@
                 <w:noProof/>
                 <w:webHidden/>
               </w:rPr>
-              <w:t>162</w:t>
+              <w:t>165</w:t>
             </w:r>
             <w:r>
               <w:rPr>
@@ -1597,7 +1597,7 @@
           <w:color w:val="000000" w:themeColor="text1"/>
         </w:rPr>
       </w:pPr>
-      <w:bookmarkStart w:id="1" w:name="_Toc215155673"/>
+      <w:bookmarkStart w:id="1" w:name="_Toc215509330"/>
       <w:r>
         <w:rPr>
           <w:rFonts w:asciiTheme="minorHAnsi" w:hAnsiTheme="minorHAnsi"/>
@@ -2697,7 +2697,7 @@
         </w:rPr>
       </w:pPr>
       <w:bookmarkStart w:id="2" w:name="_Toc214436068"/>
-      <w:bookmarkStart w:id="3" w:name="_Toc215155674"/>
+      <w:bookmarkStart w:id="3" w:name="_Toc215509331"/>
       <w:r>
         <w:rPr>
           <w:rFonts w:asciiTheme="minorHAnsi" w:hAnsiTheme="minorHAnsi"/>
@@ -4131,7 +4131,7 @@
           <w:color w:val="000000" w:themeColor="text1"/>
         </w:rPr>
       </w:pPr>
-      <w:bookmarkStart w:id="4" w:name="_Toc215155675"/>
+      <w:bookmarkStart w:id="4" w:name="_Toc215509332"/>
       <w:r>
         <w:rPr>
           <w:rFonts w:asciiTheme="minorHAnsi" w:hAnsiTheme="minorHAnsi"/>
@@ -5809,7 +5809,7 @@
         </w:rPr>
       </w:pPr>
       <w:bookmarkStart w:id="5" w:name="_Toc214436070"/>
-      <w:bookmarkStart w:id="6" w:name="_Toc215155676"/>
+      <w:bookmarkStart w:id="6" w:name="_Toc215509333"/>
       <w:r>
         <w:rPr>
           <w:rFonts w:asciiTheme="minorHAnsi" w:hAnsiTheme="minorHAnsi"/>
@@ -7790,7 +7790,7 @@
         </w:rPr>
       </w:pPr>
       <w:bookmarkStart w:id="9" w:name="_Toc214436071"/>
-      <w:bookmarkStart w:id="10" w:name="_Toc215155677"/>
+      <w:bookmarkStart w:id="10" w:name="_Toc215509334"/>
       <w:r>
         <w:rPr>
           <w:rFonts w:asciiTheme="minorHAnsi" w:hAnsiTheme="minorHAnsi"/>
@@ -8912,7 +8912,7 @@
         </w:rPr>
       </w:pPr>
       <w:bookmarkStart w:id="11" w:name="_Toc214436072"/>
-      <w:bookmarkStart w:id="12" w:name="_Toc215155678"/>
+      <w:bookmarkStart w:id="12" w:name="_Toc215509335"/>
       <w:r>
         <w:rPr>
           <w:rFonts w:asciiTheme="minorHAnsi" w:hAnsiTheme="minorHAnsi"/>
@@ -10300,7 +10300,7 @@
         </w:rPr>
       </w:pPr>
       <w:bookmarkStart w:id="13" w:name="_Toc214436073"/>
-      <w:bookmarkStart w:id="14" w:name="_Toc215155679"/>
+      <w:bookmarkStart w:id="14" w:name="_Toc215509336"/>
       <w:r>
         <w:rPr>
           <w:rFonts w:asciiTheme="minorHAnsi" w:hAnsiTheme="minorHAnsi"/>
@@ -11601,7 +11601,7 @@
         </w:rPr>
       </w:pPr>
       <w:bookmarkStart w:id="15" w:name="_Toc214436074"/>
-      <w:bookmarkStart w:id="16" w:name="_Toc215155680"/>
+      <w:bookmarkStart w:id="16" w:name="_Toc215509337"/>
       <w:r>
         <w:rPr>
           <w:rFonts w:asciiTheme="minorHAnsi" w:hAnsiTheme="minorHAnsi"/>
@@ -13009,7 +13009,7 @@
         </w:rPr>
       </w:pPr>
       <w:bookmarkStart w:id="17" w:name="_Toc214436075"/>
-      <w:bookmarkStart w:id="18" w:name="_Toc215155681"/>
+      <w:bookmarkStart w:id="18" w:name="_Toc215509338"/>
       <w:r>
         <w:rPr>
           <w:rFonts w:asciiTheme="minorHAnsi" w:hAnsiTheme="minorHAnsi"/>
@@ -14213,7 +14213,7 @@
         </w:rPr>
       </w:pPr>
       <w:bookmarkStart w:id="19" w:name="_Toc214436076"/>
-      <w:bookmarkStart w:id="20" w:name="_Toc215155682"/>
+      <w:bookmarkStart w:id="20" w:name="_Toc215509339"/>
       <w:r>
         <w:rPr>
           <w:rFonts w:asciiTheme="minorHAnsi" w:hAnsiTheme="minorHAnsi"/>
@@ -16187,7 +16187,7 @@
           <w:color w:val="000000" w:themeColor="text1"/>
         </w:rPr>
       </w:pPr>
-      <w:bookmarkStart w:id="23" w:name="_Toc215155683"/>
+      <w:bookmarkStart w:id="23" w:name="_Toc215509340"/>
       <w:r>
         <w:rPr>
           <w:rFonts w:asciiTheme="minorHAnsi" w:hAnsiTheme="minorHAnsi"/>
@@ -17707,7 +17707,7 @@
         </w:rPr>
       </w:pPr>
       <w:bookmarkStart w:id="24" w:name="_Toc214436078"/>
-      <w:bookmarkStart w:id="25" w:name="_Toc215155684"/>
+      <w:bookmarkStart w:id="25" w:name="_Toc215509341"/>
       <w:r>
         <w:rPr>
           <w:rFonts w:asciiTheme="minorHAnsi" w:hAnsiTheme="minorHAnsi"/>
@@ -19712,7 +19712,7 @@
         </w:rPr>
       </w:pPr>
       <w:bookmarkStart w:id="26" w:name="_Toc214436079"/>
-      <w:bookmarkStart w:id="27" w:name="_Toc215155685"/>
+      <w:bookmarkStart w:id="27" w:name="_Toc215509342"/>
       <w:r>
         <w:rPr>
           <w:rFonts w:asciiTheme="minorHAnsi" w:hAnsiTheme="minorHAnsi"/>
@@ -21219,7 +21219,7 @@
         </w:rPr>
       </w:pPr>
       <w:bookmarkStart w:id="29" w:name="_Toc214436080"/>
-      <w:bookmarkStart w:id="30" w:name="_Toc215155686"/>
+      <w:bookmarkStart w:id="30" w:name="_Toc215509343"/>
       <w:r>
         <w:rPr>
           <w:rFonts w:asciiTheme="minorHAnsi" w:hAnsiTheme="minorHAnsi"/>
@@ -23503,7 +23503,6 @@
         </w:rPr>
       </w:pPr>
       <w:bookmarkStart w:id="32" w:name="_Toc214436081"/>
-      <w:bookmarkStart w:id="33" w:name="_Toc215155687"/>
       <w:bookmarkEnd w:id="31"/>
       <w:r>
         <w:rPr>
@@ -23520,6 +23519,7 @@
           <w:color w:val="000000" w:themeColor="text1"/>
         </w:rPr>
       </w:pPr>
+      <w:bookmarkStart w:id="33" w:name="_Toc215509344"/>
       <w:r>
         <w:rPr>
           <w:rFonts w:asciiTheme="minorHAnsi" w:hAnsiTheme="minorHAnsi"/>
@@ -26470,7 +26470,7 @@
         </w:rPr>
       </w:pPr>
       <w:bookmarkStart w:id="34" w:name="_Toc214436082"/>
-      <w:bookmarkStart w:id="35" w:name="_Toc215155688"/>
+      <w:bookmarkStart w:id="35" w:name="_Toc215509345"/>
       <w:r>
         <w:rPr>
           <w:rFonts w:asciiTheme="minorHAnsi" w:hAnsiTheme="minorHAnsi"/>
@@ -29260,7 +29260,7 @@
           <w:color w:val="000000" w:themeColor="text1"/>
         </w:rPr>
       </w:pPr>
-      <w:bookmarkStart w:id="38" w:name="_Toc215155689"/>
+      <w:bookmarkStart w:id="38" w:name="_Toc215509346"/>
       <w:r>
         <w:rPr>
           <w:rFonts w:asciiTheme="minorHAnsi" w:hAnsiTheme="minorHAnsi"/>
@@ -30358,7 +30358,7 @@
         </w:rPr>
       </w:pPr>
       <w:bookmarkStart w:id="39" w:name="_Toc214436084"/>
-      <w:bookmarkStart w:id="40" w:name="_Toc215155690"/>
+      <w:bookmarkStart w:id="40" w:name="_Toc215509347"/>
       <w:r>
         <w:rPr>
           <w:rFonts w:asciiTheme="minorHAnsi" w:hAnsiTheme="minorHAnsi"/>
@@ -33178,7 +33178,7 @@
         </w:rPr>
       </w:pPr>
       <w:bookmarkStart w:id="42" w:name="_Toc214436085"/>
-      <w:bookmarkStart w:id="43" w:name="_Toc215155691"/>
+      <w:bookmarkStart w:id="43" w:name="_Toc215509348"/>
       <w:r>
         <w:rPr>
           <w:rFonts w:asciiTheme="minorHAnsi" w:hAnsiTheme="minorHAnsi"/>
@@ -36769,7 +36769,7 @@
           <w:color w:val="000000" w:themeColor="text1"/>
         </w:rPr>
       </w:pPr>
-      <w:bookmarkStart w:id="45" w:name="_Toc215155692"/>
+      <w:bookmarkStart w:id="45" w:name="_Toc215509349"/>
       <w:r>
         <w:rPr>
           <w:rFonts w:asciiTheme="minorHAnsi" w:hAnsiTheme="minorHAnsi"/>
@@ -38297,7 +38297,7 @@
           <w:color w:val="000000" w:themeColor="text1"/>
         </w:rPr>
         <w:pict w14:anchorId="17240BD4">
-          <v:rect id="_x0000_i1125" style="width:0;height:1.5pt" o:hralign="center" o:hrstd="t" o:hr="t" fillcolor="#a0a0a0" stroked="f"/>
+          <v:rect id="_x0000_i1044" style="width:0;height:1.5pt" o:hralign="center" o:hrstd="t" o:hr="t" fillcolor="#a0a0a0" stroked="f"/>
         </w:pict>
       </w:r>
     </w:p>
@@ -38741,7 +38741,7 @@
         </w:rPr>
       </w:pPr>
       <w:bookmarkStart w:id="46" w:name="_Toc214436087"/>
-      <w:bookmarkStart w:id="47" w:name="_Toc215155693"/>
+      <w:bookmarkStart w:id="47" w:name="_Toc215509350"/>
       <w:r>
         <w:rPr>
           <w:rFonts w:asciiTheme="minorHAnsi" w:hAnsiTheme="minorHAnsi"/>
@@ -40874,7 +40874,7 @@
           <w:color w:val="000000" w:themeColor="text1"/>
         </w:rPr>
       </w:pPr>
-      <w:bookmarkStart w:id="49" w:name="_Toc215155694"/>
+      <w:bookmarkStart w:id="49" w:name="_Toc215509351"/>
       <w:r>
         <w:rPr>
           <w:rFonts w:asciiTheme="minorHAnsi" w:hAnsiTheme="minorHAnsi"/>
@@ -51649,6 +51649,7 @@
   <w:style w:type="character" w:default="1" w:styleId="DefaultParagraphFont">
     <w:name w:val="Default Paragraph Font"/>
     <w:uiPriority w:val="1"/>
+    <w:semiHidden/>
     <w:unhideWhenUsed/>
   </w:style>
   <w:style w:type="table" w:default="1" w:styleId="TableNormal">

</xml_diff>